<commit_message>
no need for pdf report
</commit_message>
<xml_diff>
--- a/reports/CEO_Telco_Churn_Business_Report.docx
+++ b/reports/CEO_Telco_Churn_Business_Report.docx
@@ -18,7 +18,7 @@
       <w:pPr>
         <w:bidi/>
         <w:rPr>
-          <w:rFonts w:cs="Calibri" w:hint="cs"/>
+          <w:rFonts w:cs="Calibri"/>
           <w:rtl/>
           <w:lang w:bidi="fa-IR"/>
         </w:rPr>
@@ -186,7 +186,20 @@
           <w:rFonts w:cs="B Nazanin"/>
           <w:rtl/>
         </w:rPr>
-        <w:t>اندازه‌گیری نتیجه پایلوت با KPIهای مشخص: نرخ حفظ مشتری، درآمد حفظ‌شده، هزینه هر نجات موفق و نرخ پذیرش پیشنهاد.</w:t>
+        <w:t>اندازه‌گیری نتیجه پایلوت با KPI</w:t>
+      </w:r>
+      <w:r>
+        <w:rPr>
+          <w:rFonts w:cs="B Nazanin"/>
+        </w:rPr>
+        <w:t xml:space="preserve"> </w:t>
+      </w:r>
+      <w:r>
+        <w:rPr>
+          <w:rFonts w:cs="B Nazanin"/>
+          <w:rtl/>
+        </w:rPr>
+        <w:t>های مشخص: نرخ حفظ مشتری، درآمد حفظ‌شده، هزینه هر نجات موفق و نرخ پذیرش پیشنهاد.</w:t>
       </w:r>
     </w:p>
     <w:p>

</xml_diff>